<commit_message>
Update Tech Spec v1.0 with Section 9: Design Brief
Added: full color palette (hex codes for brand purple, all 5 PRISM pillars, dark bg, light bg, harm report red), typography (Inter, JetBrains Mono), two visual modes (dark marketing pages, light citizen tool with dark toggle), key UI elements (counters, harm button, gut check button, observation cards, fellowship badges, light/dark toggle), overall aesthetic direction.
</commit_message>
<xml_diff>
--- a/operations/AUDACION_TECHNICAL_SPEC_v1.docx
+++ b/operations/AUDACION_TECHNICAL_SPEC_v1.docx
@@ -24866,6 +24866,605 @@
         </w:tc>
       </w:tr>
     </w:tbl>
+    <w:p>
+      <w:r>
+        <w:br w:type="page"/>
+      </w:r>
+    </w:p>
+    <w:p>
+      <w:pPr>
+        <w:pStyle w:val="Heading1"/>
+        <w:spacing w:before="360" w:after="120"/>
+      </w:pPr>
+      <w:r>
+        <w:rPr>
+          <w:rFonts w:ascii="Arial" w:hAnsi="Arial"/>
+          <w:b/>
+          <w:sz w:val="32"/>
+          <w:color w:val="1C1C1C"/>
+        </w:rPr>
+        <w:t>9. DESIGN BRIEF</w:t>
+      </w:r>
+    </w:p>
+    <w:p>
+      <w:pPr>
+        <w:spacing w:after="120"/>
+      </w:pPr>
+      <w:r>
+        <w:rPr>
+          <w:rFonts w:ascii="Arial" w:hAnsi="Arial"/>
+          <w:sz w:val="20"/>
+        </w:rPr>
+        <w:t xml:space="preserve">One domain. Two visual modes. The public marketing pages and the logged-in citizen tool share the same brand identity but use different background treatments. Replit builds both.</w:t>
+      </w:r>
+    </w:p>
+    <w:p>
+      <w:pPr>
+        <w:pStyle w:val="Heading2"/>
+        <w:spacing w:before="240" w:after="100"/>
+      </w:pPr>
+      <w:r>
+        <w:rPr>
+          <w:rFonts w:ascii="Arial" w:hAnsi="Arial"/>
+          <w:b/>
+          <w:sz w:val="26"/>
+          <w:color w:val="2C3E50"/>
+        </w:rPr>
+        <w:t>9.1 Brand Colors (Hex Codes)</w:t>
+      </w:r>
+    </w:p>
+    <w:p>
+      <w:pPr>
+        <w:spacing w:after="80"/>
+      </w:pPr>
+      <w:r>
+        <w:rPr>
+          <w:rFonts w:ascii="Arial" w:hAnsi="Arial"/>
+          <w:b/>
+          <w:sz w:val="20"/>
+        </w:rPr>
+        <w:t xml:space="preserve">Primary Brand Purple: </w:t>
+      </w:r>
+      <w:r>
+        <w:rPr>
+          <w:rFonts w:ascii="Arial" w:hAnsi="Arial"/>
+          <w:sz w:val="20"/>
+        </w:rPr>
+        <w:t>#6C3483 (Audacion purple. Used for headings, CTAs, accent elements across both modes.)</w:t>
+      </w:r>
+    </w:p>
+    <w:p>
+      <w:pPr>
+        <w:spacing w:after="80"/>
+      </w:pPr>
+      <w:r>
+        <w:rPr>
+          <w:rFonts w:ascii="Arial" w:hAnsi="Arial"/>
+          <w:b/>
+          <w:sz w:val="20"/>
+        </w:rPr>
+        <w:t xml:space="preserve">PRISM Pillar P (Post-Deployment Behavior): </w:t>
+      </w:r>
+      <w:r>
+        <w:rPr>
+          <w:rFonts w:ascii="Arial" w:hAnsi="Arial"/>
+          <w:sz w:val="20"/>
+        </w:rPr>
+        <w:t>#C0392B (Red)</w:t>
+      </w:r>
+    </w:p>
+    <w:p>
+      <w:pPr>
+        <w:spacing w:after="80"/>
+      </w:pPr>
+      <w:r>
+        <w:rPr>
+          <w:rFonts w:ascii="Arial" w:hAnsi="Arial"/>
+          <w:b/>
+          <w:sz w:val="20"/>
+        </w:rPr>
+        <w:t xml:space="preserve">PRISM Pillar R (Runtime Research): </w:t>
+      </w:r>
+      <w:r>
+        <w:rPr>
+          <w:rFonts w:ascii="Arial" w:hAnsi="Arial"/>
+          <w:sz w:val="20"/>
+        </w:rPr>
+        <w:t>#D4AC0D (Gold)</w:t>
+      </w:r>
+    </w:p>
+    <w:p>
+      <w:pPr>
+        <w:spacing w:after="80"/>
+      </w:pPr>
+      <w:r>
+        <w:rPr>
+          <w:rFonts w:ascii="Arial" w:hAnsi="Arial"/>
+          <w:b/>
+          <w:sz w:val="20"/>
+        </w:rPr>
+        <w:t xml:space="preserve">PRISM Pillar I (Interaction Dynamics): </w:t>
+      </w:r>
+      <w:r>
+        <w:rPr>
+          <w:rFonts w:ascii="Arial" w:hAnsi="Arial"/>
+          <w:sz w:val="20"/>
+        </w:rPr>
+        <w:t>#27AE60 (Green)</w:t>
+      </w:r>
+    </w:p>
+    <w:p>
+      <w:pPr>
+        <w:spacing w:after="80"/>
+      </w:pPr>
+      <w:r>
+        <w:rPr>
+          <w:rFonts w:ascii="Arial" w:hAnsi="Arial"/>
+          <w:b/>
+          <w:sz w:val="20"/>
+        </w:rPr>
+        <w:t xml:space="preserve">PRISM Pillar S (Substrate Governance): </w:t>
+      </w:r>
+      <w:r>
+        <w:rPr>
+          <w:rFonts w:ascii="Arial" w:hAnsi="Arial"/>
+          <w:sz w:val="20"/>
+        </w:rPr>
+        <w:t>#2980B9 (Blue)</w:t>
+      </w:r>
+    </w:p>
+    <w:p>
+      <w:pPr>
+        <w:spacing w:after="80"/>
+      </w:pPr>
+      <w:r>
+        <w:rPr>
+          <w:rFonts w:ascii="Arial" w:hAnsi="Arial"/>
+          <w:b/>
+          <w:sz w:val="20"/>
+        </w:rPr>
+        <w:t xml:space="preserve">PRISM Pillar M (Multi-Agent Safety): </w:t>
+      </w:r>
+      <w:r>
+        <w:rPr>
+          <w:rFonts w:ascii="Arial" w:hAnsi="Arial"/>
+          <w:sz w:val="20"/>
+        </w:rPr>
+        <w:t>#8E44AD (Violet)</w:t>
+      </w:r>
+    </w:p>
+    <w:p>
+      <w:pPr>
+        <w:spacing w:after="80"/>
+      </w:pPr>
+      <w:r>
+        <w:rPr>
+          <w:rFonts w:ascii="Arial" w:hAnsi="Arial"/>
+          <w:b/>
+          <w:sz w:val="20"/>
+        </w:rPr>
+        <w:t xml:space="preserve">Dark Background (marketing pages): </w:t>
+      </w:r>
+      <w:r>
+        <w:rPr>
+          <w:rFonts w:ascii="Arial" w:hAnsi="Arial"/>
+          <w:sz w:val="20"/>
+        </w:rPr>
+        <w:t>#1C1C1C (near-black)</w:t>
+      </w:r>
+    </w:p>
+    <w:p>
+      <w:pPr>
+        <w:spacing w:after="80"/>
+      </w:pPr>
+      <w:r>
+        <w:rPr>
+          <w:rFonts w:ascii="Arial" w:hAnsi="Arial"/>
+          <w:b/>
+          <w:sz w:val="20"/>
+        </w:rPr>
+        <w:t xml:space="preserve">Light Background (citizen tool default): </w:t>
+      </w:r>
+      <w:r>
+        <w:rPr>
+          <w:rFonts w:ascii="Arial" w:hAnsi="Arial"/>
+          <w:sz w:val="20"/>
+        </w:rPr>
+        <w:t>#FFFFFF (white) with #F8F9FA (light gray for cards/panels)</w:t>
+      </w:r>
+    </w:p>
+    <w:p>
+      <w:pPr>
+        <w:spacing w:after="80"/>
+      </w:pPr>
+      <w:r>
+        <w:rPr>
+          <w:rFonts w:ascii="Arial" w:hAnsi="Arial"/>
+          <w:b/>
+          <w:sz w:val="20"/>
+        </w:rPr>
+        <w:t xml:space="preserve">Harm Report Accent: </w:t>
+      </w:r>
+      <w:r>
+        <w:rPr>
+          <w:rFonts w:ascii="Arial" w:hAnsi="Arial"/>
+          <w:sz w:val="20"/>
+        </w:rPr>
+        <w:t>#E74C3C (bright red, for Report AI Harm button and section)</w:t>
+      </w:r>
+    </w:p>
+    <w:p>
+      <w:pPr>
+        <w:spacing w:after="80"/>
+      </w:pPr>
+      <w:r>
+        <w:rPr>
+          <w:rFonts w:ascii="Arial" w:hAnsi="Arial"/>
+          <w:b/>
+          <w:sz w:val="20"/>
+        </w:rPr>
+        <w:t xml:space="preserve">Text (dark mode): </w:t>
+      </w:r>
+      <w:r>
+        <w:rPr>
+          <w:rFonts w:ascii="Arial" w:hAnsi="Arial"/>
+          <w:sz w:val="20"/>
+        </w:rPr>
+        <w:t>#FFFFFF (white) and #BDC3C7 (muted gray for secondary text)</w:t>
+      </w:r>
+    </w:p>
+    <w:p>
+      <w:pPr>
+        <w:spacing w:after="80"/>
+      </w:pPr>
+      <w:r>
+        <w:rPr>
+          <w:rFonts w:ascii="Arial" w:hAnsi="Arial"/>
+          <w:b/>
+          <w:sz w:val="20"/>
+        </w:rPr>
+        <w:t xml:space="preserve">Text (light mode): </w:t>
+      </w:r>
+      <w:r>
+        <w:rPr>
+          <w:rFonts w:ascii="Arial" w:hAnsi="Arial"/>
+          <w:sz w:val="20"/>
+        </w:rPr>
+        <w:t>#1C1C1C (near-black) and #7F8C8D (muted gray for secondary text)</w:t>
+      </w:r>
+    </w:p>
+    <w:p>
+      <w:pPr>
+        <w:pStyle w:val="Heading2"/>
+        <w:spacing w:before="240" w:after="100"/>
+      </w:pPr>
+      <w:r>
+        <w:rPr>
+          <w:rFonts w:ascii="Arial" w:hAnsi="Arial"/>
+          <w:b/>
+          <w:sz w:val="26"/>
+          <w:color w:val="2C3E50"/>
+        </w:rPr>
+        <w:t>9.2 Typography</w:t>
+      </w:r>
+    </w:p>
+    <w:p>
+      <w:pPr>
+        <w:spacing w:after="80"/>
+      </w:pPr>
+      <w:r>
+        <w:rPr>
+          <w:rFonts w:ascii="Arial" w:hAnsi="Arial"/>
+          <w:b/>
+          <w:sz w:val="20"/>
+        </w:rPr>
+        <w:t xml:space="preserve">Primary Font: </w:t>
+      </w:r>
+      <w:r>
+        <w:rPr>
+          <w:rFonts w:ascii="Arial" w:hAnsi="Arial"/>
+          <w:sz w:val="20"/>
+        </w:rPr>
+        <w:t>Inter (Google Font, clean sans-serif, excellent readability at all sizes, free)</w:t>
+      </w:r>
+    </w:p>
+    <w:p>
+      <w:pPr>
+        <w:spacing w:after="80"/>
+      </w:pPr>
+      <w:r>
+        <w:rPr>
+          <w:rFonts w:ascii="Arial" w:hAnsi="Arial"/>
+          <w:b/>
+          <w:sz w:val="20"/>
+        </w:rPr>
+        <w:t xml:space="preserve">Headings: </w:t>
+      </w:r>
+      <w:r>
+        <w:rPr>
+          <w:rFonts w:ascii="Arial" w:hAnsi="Arial"/>
+          <w:sz w:val="20"/>
+        </w:rPr>
+        <w:t>Inter Bold or Inter Semi-Bold</w:t>
+      </w:r>
+    </w:p>
+    <w:p>
+      <w:pPr>
+        <w:spacing w:after="80"/>
+      </w:pPr>
+      <w:r>
+        <w:rPr>
+          <w:rFonts w:ascii="Arial" w:hAnsi="Arial"/>
+          <w:b/>
+          <w:sz w:val="20"/>
+        </w:rPr>
+        <w:t xml:space="preserve">Body: </w:t>
+      </w:r>
+      <w:r>
+        <w:rPr>
+          <w:rFonts w:ascii="Arial" w:hAnsi="Arial"/>
+          <w:sz w:val="20"/>
+        </w:rPr>
+        <w:t>Inter Regular, 16px base</w:t>
+      </w:r>
+    </w:p>
+    <w:p>
+      <w:pPr>
+        <w:spacing w:after="80"/>
+      </w:pPr>
+      <w:r>
+        <w:rPr>
+          <w:rFonts w:ascii="Arial" w:hAnsi="Arial"/>
+          <w:b/>
+          <w:sz w:val="20"/>
+        </w:rPr>
+        <w:t xml:space="preserve">Monospace (for data/codes): </w:t>
+      </w:r>
+      <w:r>
+        <w:rPr>
+          <w:rFonts w:ascii="Arial" w:hAnsi="Arial"/>
+          <w:sz w:val="20"/>
+        </w:rPr>
+        <w:t>JetBrains Mono (for observation IDs, behavior codes, technical data)</w:t>
+      </w:r>
+    </w:p>
+    <w:p>
+      <w:pPr>
+        <w:pStyle w:val="Heading2"/>
+        <w:spacing w:before="240" w:after="100"/>
+      </w:pPr>
+      <w:r>
+        <w:rPr>
+          <w:rFonts w:ascii="Arial" w:hAnsi="Arial"/>
+          <w:b/>
+          <w:sz w:val="26"/>
+          <w:color w:val="2C3E50"/>
+        </w:rPr>
+        <w:t>9.3 Two Visual Modes (One Domain)</w:t>
+      </w:r>
+    </w:p>
+    <w:p>
+      <w:pPr>
+        <w:spacing w:after="120"/>
+      </w:pPr>
+      <w:r>
+        <w:rPr>
+          <w:rFonts w:ascii="Arial" w:hAnsi="Arial"/>
+          <w:b/>
+          <w:sz w:val="20"/>
+        </w:rPr>
+        <w:t xml:space="preserve">Mode 1: Public Marketing Pages (dark background). </w:t>
+      </w:r>
+      <w:r>
+        <w:rPr>
+          <w:rFonts w:ascii="Arial" w:hAnsi="Arial"/>
+          <w:sz w:val="20"/>
+        </w:rPr>
+        <w:t xml:space="preserve">Pages: Home, About, Research, Blog, Careers, Contribute, Donate, Contact, Partners, Press, Training, PRISM Summit, Report AI Harm. Background: #1C1C1C (near-black). Text: white and muted gray. PRISM beam colors as accents on pillar cards, section dividers, and CTAs. Logo: Prism “A” with five color beams. Tone: bold, independent, aspirational. The front of the house.</w:t>
+      </w:r>
+    </w:p>
+    <w:p>
+      <w:pPr>
+        <w:spacing w:after="120"/>
+      </w:pPr>
+      <w:r>
+        <w:rPr>
+          <w:rFonts w:ascii="Arial" w:hAnsi="Arial"/>
+          <w:b/>
+          <w:sz w:val="20"/>
+        </w:rPr>
+        <w:t xml:space="preserve">Mode 2: Citizen Tool (light background, default). </w:t>
+      </w:r>
+      <w:r>
+        <w:rPr>
+          <w:rFonts w:ascii="Arial" w:hAnsi="Arial"/>
+          <w:sz w:val="20"/>
+        </w:rPr>
+        <w:t xml:space="preserve">Pages: Dashboard, Profile, Submit Observation, Submit EOT, My Observations, My Points and Tier, Leaderboard, Investigation Mode, Settings. Background: #FFFFFF (white) with #F8F9FA (light gray cards). Text: near-black and muted gray. PRISM beam colors as accent borders on observation cards (each observation shows its pillar color). Audacion purple for navigation, buttons, and interactive elements. Light/dark mode toggle in settings (citizen chooses). Tone: clean, functional, SaaS-standard. The workspace.</w:t>
+      </w:r>
+    </w:p>
+    <w:p>
+      <w:pPr>
+        <w:spacing w:after="120"/>
+      </w:pPr>
+      <w:r>
+        <w:rPr>
+          <w:rFonts w:ascii="Arial" w:hAnsi="Arial"/>
+          <w:b/>
+          <w:sz w:val="20"/>
+        </w:rPr>
+        <w:t xml:space="preserve">Mode 3: Research Dashboard (internal, light background). </w:t>
+      </w:r>
+      <w:r>
+        <w:rPr>
+          <w:rFonts w:ascii="Arial" w:hAnsi="Arial"/>
+          <w:sz w:val="20"/>
+        </w:rPr>
+        <w:t xml:space="preserve">Access: Research team only. Utilitarian design. Data-dense tables, chart views, classification tools, unclassified queue, discovery attribution, analytics. Same color system but optimized for data work, not citizen experience. Phase 3 build.</w:t>
+      </w:r>
+    </w:p>
+    <w:p>
+      <w:pPr>
+        <w:pStyle w:val="Heading2"/>
+        <w:spacing w:before="240" w:after="100"/>
+      </w:pPr>
+      <w:r>
+        <w:rPr>
+          <w:rFonts w:ascii="Arial" w:hAnsi="Arial"/>
+          <w:b/>
+          <w:sz w:val="26"/>
+          <w:color w:val="2C3E50"/>
+        </w:rPr>
+        <w:t>9.4 Key UI Elements</w:t>
+      </w:r>
+    </w:p>
+    <w:p>
+      <w:pPr>
+        <w:spacing w:after="80"/>
+      </w:pPr>
+      <w:r>
+        <w:rPr>
+          <w:rFonts w:ascii="Arial" w:hAnsi="Arial"/>
+          <w:b/>
+          <w:sz w:val="20"/>
+        </w:rPr>
+        <w:t xml:space="preserve">Live Counters: </w:t>
+      </w:r>
+      <w:r>
+        <w:rPr>
+          <w:rFonts w:ascii="Arial" w:hAnsi="Arial"/>
+          <w:sz w:val="20"/>
+        </w:rPr>
+        <w:t xml:space="preserve">Visible on homepage (dark) and citizen dashboard (light). Animated number counting. Two counters: “Contributors: X of 1,000,000” and “Observations: X of 1,000,000,000.” Progress bar underneath each. Audacion purple fill.</w:t>
+      </w:r>
+    </w:p>
+    <w:p>
+      <w:pPr>
+        <w:spacing w:after="80"/>
+      </w:pPr>
+      <w:r>
+        <w:rPr>
+          <w:rFonts w:ascii="Arial" w:hAnsi="Arial"/>
+          <w:b/>
+          <w:sz w:val="20"/>
+        </w:rPr>
+        <w:t xml:space="preserve">Report AI Harm Button: </w:t>
+      </w:r>
+      <w:r>
+        <w:rPr>
+          <w:rFonts w:ascii="Arial" w:hAnsi="Arial"/>
+          <w:sz w:val="20"/>
+        </w:rPr>
+        <w:t xml:space="preserve">Red (#E74C3C). Visible on every page, both modes. Fixed position (bottom corner or top navigation). Distinct from all other UI elements. Cannot be missed.</w:t>
+      </w:r>
+    </w:p>
+    <w:p>
+      <w:pPr>
+        <w:spacing w:after="80"/>
+      </w:pPr>
+      <w:r>
+        <w:rPr>
+          <w:rFonts w:ascii="Arial" w:hAnsi="Arial"/>
+          <w:b/>
+          <w:sz w:val="20"/>
+        </w:rPr>
+        <w:t xml:space="preserve">Gut Check Button (citizen tool): </w:t>
+      </w:r>
+      <w:r>
+        <w:rPr>
+          <w:rFonts w:ascii="Arial" w:hAnsi="Arial"/>
+          <w:sz w:val="20"/>
+        </w:rPr>
+        <w:t xml:space="preserve">Floating action button on citizen dashboard. Audacion purple. Tap to open quick observation form: emotion selector, behavior dropdown (organized by PRISM pillar with color-coded borders), optional note field, submit.</w:t>
+      </w:r>
+    </w:p>
+    <w:p>
+      <w:pPr>
+        <w:spacing w:after="80"/>
+      </w:pPr>
+      <w:r>
+        <w:rPr>
+          <w:rFonts w:ascii="Arial" w:hAnsi="Arial"/>
+          <w:b/>
+          <w:sz w:val="20"/>
+        </w:rPr>
+        <w:t xml:space="preserve">Observation Cards: </w:t>
+      </w:r>
+      <w:r>
+        <w:rPr>
+          <w:rFonts w:ascii="Arial" w:hAnsi="Arial"/>
+          <w:sz w:val="20"/>
+        </w:rPr>
+        <w:t xml:space="preserve">Each submitted observation displays as a card with left-border color matching its PRISM pillar. Shows: behavior name, emotion tag, timestamp, depth level, severity. Citizen can expand to see full details.</w:t>
+      </w:r>
+    </w:p>
+    <w:p>
+      <w:pPr>
+        <w:spacing w:after="80"/>
+      </w:pPr>
+      <w:r>
+        <w:rPr>
+          <w:rFonts w:ascii="Arial" w:hAnsi="Arial"/>
+          <w:b/>
+          <w:sz w:val="20"/>
+        </w:rPr>
+        <w:t xml:space="preserve">Fellowship Tier Badge: </w:t>
+      </w:r>
+      <w:r>
+        <w:rPr>
+          <w:rFonts w:ascii="Arial" w:hAnsi="Arial"/>
+          <w:sz w:val="20"/>
+        </w:rPr>
+        <w:t xml:space="preserve">Displayed on citizen profile and leaderboard. Four tiers: Field Researcher, Senior Researcher, Expert Researcher, Fellow. Badge design uses PRISM beam aesthetic: more beams as tier increases.</w:t>
+      </w:r>
+    </w:p>
+    <w:p>
+      <w:pPr>
+        <w:spacing w:after="80"/>
+      </w:pPr>
+      <w:r>
+        <w:rPr>
+          <w:rFonts w:ascii="Arial" w:hAnsi="Arial"/>
+          <w:b/>
+          <w:sz w:val="20"/>
+        </w:rPr>
+        <w:t xml:space="preserve">Light/Dark Toggle: </w:t>
+      </w:r>
+      <w:r>
+        <w:rPr>
+          <w:rFonts w:ascii="Arial" w:hAnsi="Arial"/>
+          <w:sz w:val="20"/>
+        </w:rPr>
+        <w:t xml:space="preserve">Available in citizen tool settings. Default: light mode. Dark mode uses #1C1C1C background with same accent colors. User preference persisted in profile.</w:t>
+      </w:r>
+    </w:p>
+    <w:p>
+      <w:pPr>
+        <w:pStyle w:val="Heading2"/>
+        <w:spacing w:before="240" w:after="100"/>
+      </w:pPr>
+      <w:r>
+        <w:rPr>
+          <w:rFonts w:ascii="Arial" w:hAnsi="Arial"/>
+          <w:b/>
+          <w:sz w:val="26"/>
+          <w:color w:val="2C3E50"/>
+        </w:rPr>
+        <w:t>9.5 Overall Aesthetic</w:t>
+      </w:r>
+    </w:p>
+    <w:p>
+      <w:pPr>
+        <w:spacing w:after="120"/>
+      </w:pPr>
+      <w:r>
+        <w:rPr>
+          <w:rFonts w:ascii="Arial" w:hAnsi="Arial"/>
+          <w:sz w:val="20"/>
+        </w:rPr>
+        <w:t xml:space="preserve">The brand is bold, independent, and scientific without being academic. Think: a research lab that a founder built, not a university department. The marketing pages should feel like walking into a modern gallery at night: dark, focused, with color used deliberately and sparingly. The citizen tool should feel like a well-designed SaaS product: clean, white space, intuitive, fast. The PRISM colors are the connective thread between both modes. They appear on pillar cards, observation borders, badge designs, and accent elements. They never dominate. They orient.</w:t>
+      </w:r>
+    </w:p>
     <w:sectPr>
       <w:pgSz w:w="12240" w:h="15840" w:orient="portrait"/>
       <w:pgMar w:top="1080" w:right="1080" w:bottom="1080" w:left="1080" w:header="708" w:footer="708" w:gutter="0"/>

</xml_diff>

<commit_message>
Add LinkedIn credential integration for fellowship tiers — Phase 1 feature
Updated: Start Observing (fellowship section with full credential description), Sign Up / Get Started (tier description updated), Tech Spec (new UI element: LinkedIn Credential Integration via Credly, Phase 1, automated issuance on tier threshold).

Inspired by Lovable's LinkedIn certification model. Each tier is a verified professional credential, not a game badge. Drives: citizen credibility, organic brand awareness, recruitment through LinkedIn visibility.
</commit_message>
<xml_diff>
--- a/operations/AUDACION_TECHNICAL_SPEC_v1.docx
+++ b/operations/AUDACION_TECHNICAL_SPEC_v1.docx
@@ -25428,6 +25428,26 @@
           <w:b/>
           <w:sz w:val="20"/>
         </w:rPr>
+        <w:t xml:space="preserve">LinkedIn Credential Integration (Phase 1): </w:t>
+      </w:r>
+      <w:r>
+        <w:rPr>
+          <w:rFonts w:ascii="Arial" w:hAnsi="Arial"/>
+          <w:sz w:val="20"/>
+        </w:rPr>
+        <w:t xml:space="preserve">Each fellowship tier is a verified digital credential issued through Credly (or equivalent platform). When a citizen reaches a new tier, they receive an automated credential they can add to their LinkedIn profile with one click. Shows as “PRISM [Tier Name], Audacion AI Labs” in Licenses and Certifications. This is a professional credential, not a game badge. It drives organic brand awareness (every LinkedIn viewer sees Audacion), professional credibility for the citizen, and recruitment (connections ask “what is that?” and click through to our site). Credential issuing organization: Audacion AI Labs. Credential template per tier. Automated issuance on tier threshold. One-click LinkedIn add. This is a Phase 1 feature. It is that important for growth.</w:t>
+      </w:r>
+    </w:p>
+    <w:p>
+      <w:pPr>
+        <w:spacing w:after="80"/>
+      </w:pPr>
+      <w:r>
+        <w:rPr>
+          <w:rFonts w:ascii="Arial" w:hAnsi="Arial"/>
+          <w:b/>
+          <w:sz w:val="20"/>
+        </w:rPr>
         <w:t xml:space="preserve">Light/Dark Toggle: </w:t>
       </w:r>
       <w:r>

</xml_diff>

<commit_message>
MAJOR SECURITY UPDATE: Tech Spec now has 10 security rules
Rule 1: External database (Supabase/Neon/PlanetScale/AWS RDS), NOT Replit built-in
Rule 2: Automated daily backups to TWO cloud providers (AWS S3 + Google Cloud Storage)
Rule 3: Harm report data highest security tier, separate encrypted storage, restricted access
Rule 4: Cloudflare DDoS protection and CDN
Rule 5: Rate limiting all endpoints (observations, harm reports, signups, logins, partner API)
Rule 6: Auth security (bcrypt, OAuth, 2FA for admin/research, JWT, secure cookies, CSRF)
Rule 7: Environment variable security (never hardcode, never commit, rotate quarterly)
Rule 8: Data residency and GDPR/CCPA compliance
Rule 9: Incident response plan (72-hour notification, CEO notified within 1 hour)
Rule 10: Migration path off Replit (external DB + external backups = portable from day one)
</commit_message>
<xml_diff>
--- a/operations/AUDACION_TECHNICAL_SPEC_v1.docx
+++ b/operations/AUDACION_TECHNICAL_SPEC_v1.docx
@@ -23134,6 +23134,232 @@
           <w:szCs w:val="20"/>
         </w:rPr>
         <w:t xml:space="preserve">All PII encrypted at rest (AES-256). All data in transit encrypted (TLS 1.3). Response captures stored in separate encrypted storage from citizen profiles. IP addresses stored ONLY in audit log (Table 11), never in citizen profiles. Harm report evidence stored with highest security tier. GDPR/CCPA compliance: citizens can export and delete their data.</w:t>
+      </w:r>
+    </w:p>
+    <w:p>
+      <w:pPr>
+        <w:spacing w:after="120"/>
+      </w:pPr>
+      <w:r>
+        <w:rPr>
+          <w:rFonts w:ascii="Arial" w:hAnsi="Arial"/>
+          <w:b/>
+          <w:sz w:val="24"/>
+          <w:color w:val="C0392B"/>
+        </w:rPr>
+        <w:t>CRITICAL: Infrastructure Security</w:t>
+      </w:r>
+    </w:p>
+    <w:p>
+      <w:pPr>
+        <w:spacing w:after="100"/>
+      </w:pPr>
+      <w:r>
+        <w:rPr>
+          <w:rFonts w:ascii="Arial" w:hAnsi="Arial"/>
+          <w:sz w:val="20"/>
+        </w:rPr>
+        <w:t xml:space="preserve">Replit and Lovable have documented security vulnerabilities (data breaches, public project defaults, environment variable leaks). Audacion collects highly sensitive data: harm reports from people in crisis, evidence of AI abuse, personal information, emotional data. The infrastructure must be hardened beyond the defaults of any vibe-coding platform.</w:t>
+      </w:r>
+    </w:p>
+    <w:p>
+      <w:pPr>
+        <w:spacing w:after="80"/>
+      </w:pPr>
+      <w:r>
+        <w:rPr>
+          <w:rFonts w:ascii="Arial" w:hAnsi="Arial"/>
+          <w:b/>
+          <w:sz w:val="20"/>
+        </w:rPr>
+        <w:t xml:space="preserve">Rule 1: DO NOT store production data on Replit's built-in database. </w:t>
+      </w:r>
+      <w:r>
+        <w:rPr>
+          <w:rFonts w:ascii="Arial" w:hAnsi="Arial"/>
+          <w:sz w:val="20"/>
+        </w:rPr>
+        <w:t xml:space="preserve">Use an external managed database provider: Supabase (PostgreSQL, free tier to start, built-in auth, row-level security), Neon (serverless PostgreSQL), PlanetScale (MySQL), or AWS RDS. The database lives OUTSIDE of Replit. Replit connects to it via environment variables. If Replit is compromised, the data is not on their servers.</w:t>
+      </w:r>
+    </w:p>
+    <w:p>
+      <w:pPr>
+        <w:spacing w:after="80"/>
+      </w:pPr>
+      <w:r>
+        <w:rPr>
+          <w:rFonts w:ascii="Arial" w:hAnsi="Arial"/>
+          <w:b/>
+          <w:sz w:val="20"/>
+        </w:rPr>
+        <w:t xml:space="preserve">Rule 2: Automated daily backups to TWO separate cloud providers. </w:t>
+      </w:r>
+      <w:r>
+        <w:rPr>
+          <w:rFonts w:ascii="Arial" w:hAnsi="Arial"/>
+          <w:sz w:val="20"/>
+        </w:rPr>
+        <w:t xml:space="preserve">Primary backup: AWS S3 (encrypted bucket, versioned, lifecycle policy retaining 90 days). Secondary backup: Google Cloud Storage (separate credentials, separate region). Backups run nightly via automated cron job. Point-in-time recovery capability on the primary database. If one provider goes down or is breached, the other has a complete copy. Weekly test restores to verify backup integrity.</w:t>
+      </w:r>
+    </w:p>
+    <w:p>
+      <w:pPr>
+        <w:spacing w:after="80"/>
+      </w:pPr>
+      <w:r>
+        <w:rPr>
+          <w:rFonts w:ascii="Arial" w:hAnsi="Arial"/>
+          <w:b/>
+          <w:sz w:val="20"/>
+        </w:rPr>
+        <w:t xml:space="preserve">Rule 3: Harm report data gets the highest security tier. </w:t>
+      </w:r>
+      <w:r>
+        <w:rPr>
+          <w:rFonts w:ascii="Arial" w:hAnsi="Arial"/>
+          <w:sz w:val="20"/>
+        </w:rPr>
+        <w:t xml:space="preserve">Harm report evidence (screenshots, conversation exports, video links) stored in a SEPARATE encrypted storage bucket from general observation data. Access restricted to Behavioral Health Advisor and Admin roles only. Audit log tracks every access. Evidence files encrypted with separate key from main database. Harm reports containing crisis indicators flagged for immediate review and handled under stricter access controls than general observations.</w:t>
+      </w:r>
+    </w:p>
+    <w:p>
+      <w:pPr>
+        <w:spacing w:after="80"/>
+      </w:pPr>
+      <w:r>
+        <w:rPr>
+          <w:rFonts w:ascii="Arial" w:hAnsi="Arial"/>
+          <w:b/>
+          <w:sz w:val="20"/>
+        </w:rPr>
+        <w:t xml:space="preserve">Rule 4: DDoS protection and CDN. </w:t>
+      </w:r>
+      <w:r>
+        <w:rPr>
+          <w:rFonts w:ascii="Arial" w:hAnsi="Arial"/>
+          <w:sz w:val="20"/>
+        </w:rPr>
+        <w:t xml:space="preserve">Put the site behind Cloudflare (free tier to start). DDoS mitigation, SSL termination, CDN for static assets, rate limiting at the edge. Custom domain (audacionailabs.com) DNS managed through Cloudflare. All traffic routes through Cloudflare before reaching the application.</w:t>
+      </w:r>
+    </w:p>
+    <w:p>
+      <w:pPr>
+        <w:spacing w:after="80"/>
+      </w:pPr>
+      <w:r>
+        <w:rPr>
+          <w:rFonts w:ascii="Arial" w:hAnsi="Arial"/>
+          <w:b/>
+          <w:sz w:val="20"/>
+        </w:rPr>
+        <w:t xml:space="preserve">Rule 5: Rate limiting on all API endpoints. </w:t>
+      </w:r>
+      <w:r>
+        <w:rPr>
+          <w:rFonts w:ascii="Arial" w:hAnsi="Arial"/>
+          <w:sz w:val="20"/>
+        </w:rPr>
+        <w:t xml:space="preserve">Observation submissions: 60 per hour per citizen (prevents spam and abuse). Harm reports: 10 per hour per IP (prevents abuse while allowing legitimate multiple reports). Sign-up: 5 per hour per IP (prevents bot registrations). Login attempts: 5 per 15 minutes per account (brute force protection, lockout after 5 failures with email notification). Partner API: rate limits per API key per tier. All rate limit violations logged to audit table.</w:t>
+      </w:r>
+    </w:p>
+    <w:p>
+      <w:pPr>
+        <w:spacing w:after="80"/>
+      </w:pPr>
+      <w:r>
+        <w:rPr>
+          <w:rFonts w:ascii="Arial" w:hAnsi="Arial"/>
+          <w:b/>
+          <w:sz w:val="20"/>
+        </w:rPr>
+        <w:t xml:space="preserve">Rule 6: Authentication security. </w:t>
+      </w:r>
+      <w:r>
+        <w:rPr>
+          <w:rFonts w:ascii="Arial" w:hAnsi="Arial"/>
+          <w:sz w:val="20"/>
+        </w:rPr>
+        <w:t xml:space="preserve">Passwords hashed with bcrypt (cost factor 12). Google/Apple OAuth for social login. Two-factor authentication (2FA) required for Admin and Research Team roles. Optional for citizens. Session tokens: JWT with 24-hour expiry, refresh token rotation. Secure cookie flags (HttpOnly, Secure, SameSite=Strict). CSRF protection on all forms.</w:t>
+      </w:r>
+    </w:p>
+    <w:p>
+      <w:pPr>
+        <w:spacing w:after="80"/>
+      </w:pPr>
+      <w:r>
+        <w:rPr>
+          <w:rFonts w:ascii="Arial" w:hAnsi="Arial"/>
+          <w:b/>
+          <w:sz w:val="20"/>
+        </w:rPr>
+        <w:t xml:space="preserve">Rule 7: Environment variable security. </w:t>
+      </w:r>
+      <w:r>
+        <w:rPr>
+          <w:rFonts w:ascii="Arial" w:hAnsi="Arial"/>
+          <w:sz w:val="20"/>
+        </w:rPr>
+        <w:t xml:space="preserve">All secrets (database credentials, API keys, Stripe keys, Credly keys, encryption keys) stored in Replit Secrets or equivalent secure environment variable store. NEVER hardcoded in source code. NEVER committed to Git. The .env file is in .gitignore. Rotate database credentials quarterly. Rotate API keys on any suspected compromise.</w:t>
+      </w:r>
+    </w:p>
+    <w:p>
+      <w:pPr>
+        <w:spacing w:after="80"/>
+      </w:pPr>
+      <w:r>
+        <w:rPr>
+          <w:rFonts w:ascii="Arial" w:hAnsi="Arial"/>
+          <w:b/>
+          <w:sz w:val="20"/>
+        </w:rPr>
+        <w:t xml:space="preserve">Rule 8: Data residency and compliance. </w:t>
+      </w:r>
+      <w:r>
+        <w:rPr>
+          <w:rFonts w:ascii="Arial" w:hAnsi="Arial"/>
+          <w:sz w:val="20"/>
+        </w:rPr>
+        <w:t xml:space="preserve">Primary database and backups in US region (us-east-1 or us-west-2). GDPR compliance for EU citizens: right to access, right to erasure, right to data portability. CCPA compliance for California citizens. Privacy Policy and Terms of Service must reflect actual data handling practices. Data Processing Agreement (DPA) available for enterprise partners.</w:t>
+      </w:r>
+    </w:p>
+    <w:p>
+      <w:pPr>
+        <w:spacing w:after="80"/>
+      </w:pPr>
+      <w:r>
+        <w:rPr>
+          <w:rFonts w:ascii="Arial" w:hAnsi="Arial"/>
+          <w:b/>
+          <w:sz w:val="20"/>
+        </w:rPr>
+        <w:t xml:space="preserve">Rule 9: Incident response plan. </w:t>
+      </w:r>
+      <w:r>
+        <w:rPr>
+          <w:rFonts w:ascii="Arial" w:hAnsi="Arial"/>
+          <w:sz w:val="20"/>
+        </w:rPr>
+        <w:t xml:space="preserve">If a breach is detected: (1) Isolate the affected system immediately. (2) Assess scope: which data was exposed, which citizens are affected. (3) Notify affected citizens within 72 hours per GDPR requirement. (4) Rotate all credentials. (5) Restore from verified backup. (6) Publish a transparent incident report. (7) Implement fixes to prevent recurrence. CEO (Dee Williams) is notified of any security incident within 1 hour of detection.</w:t>
+      </w:r>
+    </w:p>
+    <w:p>
+      <w:pPr>
+        <w:spacing w:after="80"/>
+      </w:pPr>
+      <w:r>
+        <w:rPr>
+          <w:rFonts w:ascii="Arial" w:hAnsi="Arial"/>
+          <w:b/>
+          <w:sz w:val="20"/>
+        </w:rPr>
+        <w:t xml:space="preserve">Rule 10: Migration path off Replit. </w:t>
+      </w:r>
+      <w:r>
+        <w:rPr>
+          <w:rFonts w:ascii="Arial" w:hAnsi="Arial"/>
+          <w:sz w:val="20"/>
+        </w:rPr>
+        <w:t xml:space="preserve">Because the database is external and the backups are on separate providers, the entire application can be migrated off Replit to Vercel, Railway, Render, AWS, or any other host without data loss and within 24 hours. This is intentional. The hosting platform is replaceable. The data and the infrastructure around it are not. Build with portability from day one.</w:t>
       </w:r>
     </w:p>
     <w:p>

</xml_diff>

<commit_message>
Update security to phased approach: Replit DB Phase 1, external DB when revenue allows. Google Drive backups Phase 1, cloud provider backups Phase 2+. App-level encryption on sensitive fields before writing to any database. Realistic for zero additional spend.
</commit_message>
<xml_diff>
--- a/operations/AUDACION_TECHNICAL_SPEC_v1.docx
+++ b/operations/AUDACION_TECHNICAL_SPEC_v1.docx
@@ -23133,7 +23133,7 @@
           <w:sz w:val="20"/>
           <w:szCs w:val="20"/>
         </w:rPr>
-        <w:t xml:space="preserve">All PII encrypted at rest (AES-256). All data in transit encrypted (TLS 1.3). Response captures stored in separate encrypted storage from citizen profiles. IP addresses stored ONLY in audit log (Table 11), never in citizen profiles. Harm report evidence stored with highest security tier. GDPR/CCPA compliance: citizens can export and delete their data.</w:t>
+        <w:t xml:space="preserve">All PII encrypted at rest (AES-256). All data in transit encrypted (TLS 1.3). CRITICAL: Application-level encryption on sensitive fields (harm report text, evidence metadata, personal details) BEFORE writing to the database. This means even if the database is compromised, the attacker gets encrypted strings, not readable data. This costs nothing extra. It is just code. Response captures stored in separate encrypted storage from citizen profiles. IP addresses stored ONLY in audit log (Table 11), never in citizen profiles. Harm report evidence stored with highest security tier. GDPR/CCPA compliance: citizens can export and delete their data.</w:t>
       </w:r>
     </w:p>
     <w:p>
@@ -23179,7 +23179,7 @@
           <w:rFonts w:ascii="Arial" w:hAnsi="Arial"/>
           <w:sz w:val="20"/>
         </w:rPr>
-        <w:t xml:space="preserve">Use an external managed database provider: Supabase (PostgreSQL, free tier to start, built-in auth, row-level security), Neon (serverless PostgreSQL), PlanetScale (MySQL), or AWS RDS. The database lives OUTSIDE of Replit. Replit connects to it via environment variables. If Replit is compromised, the data is not on their servers.</w:t>
+        <w:t xml:space="preserve">Phase 1 (launch): Build on Replit's built-in database (PostgreSQL). This is where the platform starts. No additional database cost. When revenue supports it (Phase 2+), migrate to an external managed database provider (Supabase, Neon, PlanetScale, or AWS RDS) so the data lives independently of the hosting platform. The application code should be written with this migration in mind: use standard PostgreSQL queries, no Replit-specific database features that would lock you in.</w:t>
       </w:r>
     </w:p>
     <w:p>
@@ -23199,7 +23199,7 @@
           <w:rFonts w:ascii="Arial" w:hAnsi="Arial"/>
           <w:sz w:val="20"/>
         </w:rPr>
-        <w:t xml:space="preserve">Primary backup: AWS S3 (encrypted bucket, versioned, lifecycle policy retaining 90 days). Secondary backup: Google Cloud Storage (separate credentials, separate region). Backups run nightly via automated cron job. Point-in-time recovery capability on the primary database. If one provider goes down or is breached, the other has a complete copy. Weekly test restores to verify backup integrity.</w:t>
+        <w:t xml:space="preserve">Phase 1: Automated nightly backup script that exports the database and uploads to a private Google Drive folder. This costs zero and ensures a copy exists outside of Replit. Phase 2+ (when revenue allows): Add a second backup to AWS S3 or Google Cloud Storage with separate credentials and separate region. Point-in-time recovery on the primary database. Weekly test restores to verify backup integrity. The nightly Google Drive backup continues as a third layer.</w:t>
       </w:r>
     </w:p>
     <w:p>

</xml_diff>

<commit_message>
Rewrite security as REQUIREMENTS not prescriptions. Enterprise-ready, multi-tenant, multi-user.
Security section now tells Replit WHAT we need, not HOW to build it. 10 requirements: enterprise architecture, no unauthorized access, encrypted data, harm report highest protection, external backups, abuse protection, secure secrets, privacy compliance, incident response, portability. Replit implements however works best on their platform. Build Prompt updated with architecture and security summary.
</commit_message>
<xml_diff>
--- a/operations/AUDACION_TECHNICAL_SPEC_v1.docx
+++ b/operations/AUDACION_TECHNICAL_SPEC_v1.docx
@@ -23152,14 +23152,14 @@
     </w:p>
     <w:p>
       <w:pPr>
-        <w:spacing w:after="100"/>
+        <w:spacing w:after="120"/>
       </w:pPr>
       <w:r>
         <w:rPr>
           <w:rFonts w:ascii="Arial" w:hAnsi="Arial"/>
           <w:sz w:val="20"/>
         </w:rPr>
-        <w:t xml:space="preserve">Replit and Lovable have documented security vulnerabilities (data breaches, public project defaults, environment variable leaks). Audacion collects highly sensitive data: harm reports from people in crisis, evidence of AI abuse, personal information, emotional data. The infrastructure must be hardened beyond the defaults of any vibe-coding platform.</w:t>
+        <w:t xml:space="preserve">This platform collects highly sensitive data: harm reports from people in crisis, evidence of AI abuse, personal information, and emotional data. Security is not optional. The following are REQUIREMENTS (what we need), not prescriptions (how to build it). Implement these using whatever tools, services, and patterns work best on your platform. If you have a better way to achieve any of these than what is described here, use your way. We trust your platform expertise. Just meet the requirement.</w:t>
       </w:r>
     </w:p>
     <w:p>
@@ -23172,14 +23172,14 @@
           <w:b/>
           <w:sz w:val="20"/>
         </w:rPr>
-        <w:t xml:space="preserve">Rule 1: DO NOT store production data on Replit's built-in database. </w:t>
+        <w:t xml:space="preserve">Requirement 1: Enterprise-ready, multi-tenant, multi-user architecture. </w:t>
       </w:r>
       <w:r>
         <w:rPr>
           <w:rFonts w:ascii="Arial" w:hAnsi="Arial"/>
           <w:sz w:val="20"/>
         </w:rPr>
-        <w:t xml:space="preserve">Phase 1 (launch): Build on Replit's built-in database (PostgreSQL). This is where the platform starts. No additional database cost. When revenue supports it (Phase 2+), migrate to an external managed database provider (Supabase, Neon, PlanetScale, or AWS RDS) so the data lives independently of the hosting platform. The application code should be written with this migration in mind: use standard PostgreSQL queries, no Replit-specific database features that would lock you in.</w:t>
+        <w:t xml:space="preserve">The platform supports multiple user roles (Citizen, Research Team, Data Partner, Admin) with different access levels, dashboards, and permissions. Data is isolated between roles. A citizen never sees another citizen's data. A data partner sees only anonymized aggregates. Admin sees everything. Build this to scale from hundreds to millions of users.</w:t>
       </w:r>
     </w:p>
     <w:p>
@@ -23192,14 +23192,14 @@
           <w:b/>
           <w:sz w:val="20"/>
         </w:rPr>
-        <w:t xml:space="preserve">Rule 2: Automated daily backups to TWO separate cloud providers. </w:t>
+        <w:t xml:space="preserve">Requirement 2: No unauthorized access. </w:t>
       </w:r>
       <w:r>
         <w:rPr>
           <w:rFonts w:ascii="Arial" w:hAnsi="Arial"/>
           <w:sz w:val="20"/>
         </w:rPr>
-        <w:t xml:space="preserve">Phase 1: Automated nightly backup script that exports the database and uploads to a private Google Drive folder. This costs zero and ensures a copy exists outside of Replit. Phase 2+ (when revenue allows): Add a second backup to AWS S3 or Google Cloud Storage with separate credentials and separate region. Point-in-time recovery on the primary database. Weekly test restores to verify backup integrity. The nightly Google Drive backup continues as a third layer.</w:t>
+        <w:t xml:space="preserve">Production-grade authentication. Protect against brute force login attempts, session hijacking, credential stuffing, and unauthorized API access. Admin and Research Team accounts must have stronger authentication than citizen accounts (two-factor or equivalent). Login failures must be rate-limited and logged. Suspicious activity must be flagged. Show us what security measures you are implementing.</w:t>
       </w:r>
     </w:p>
     <w:p>
@@ -23212,14 +23212,14 @@
           <w:b/>
           <w:sz w:val="20"/>
         </w:rPr>
-        <w:t xml:space="preserve">Rule 3: Harm report data gets the highest security tier. </w:t>
+        <w:t xml:space="preserve">Requirement 3: All sensitive data must be encrypted. </w:t>
       </w:r>
       <w:r>
         <w:rPr>
           <w:rFonts w:ascii="Arial" w:hAnsi="Arial"/>
           <w:sz w:val="20"/>
         </w:rPr>
-        <w:t xml:space="preserve">Harm report evidence (screenshots, conversation exports, video links) stored in a SEPARATE encrypted storage bucket from general observation data. Access restricted to Behavioral Health Advisor and Admin roles only. Audit log tracks every access. Evidence files encrypted with separate key from main database. Harm reports containing crisis indicators flagged for immediate review and handled under stricter access controls than general observations.</w:t>
+        <w:t xml:space="preserve">Citizen personal information, harm report content, evidence uploads, emotional data, and response captures must be encrypted at rest and in transit. If the database is ever compromised, the attacker should not be able to read sensitive fields. Application-level encryption on the most sensitive fields (harm report text, evidence metadata, contact information) before writing to the database is strongly preferred.</w:t>
       </w:r>
     </w:p>
     <w:p>
@@ -23232,14 +23232,14 @@
           <w:b/>
           <w:sz w:val="20"/>
         </w:rPr>
-        <w:t xml:space="preserve">Rule 4: DDoS protection and CDN. </w:t>
+        <w:t xml:space="preserve">Requirement 4: Harm report data gets the highest protection level. </w:t>
       </w:r>
       <w:r>
         <w:rPr>
           <w:rFonts w:ascii="Arial" w:hAnsi="Arial"/>
           <w:sz w:val="20"/>
         </w:rPr>
-        <w:t xml:space="preserve">Put the site behind Cloudflare (free tier to start). DDoS mitigation, SSL termination, CDN for static assets, rate limiting at the edge. Custom domain (audacionailabs.com) DNS managed through Cloudflare. All traffic routes through Cloudflare before reaching the application.</w:t>
+        <w:t xml:space="preserve">Harm reports contain crisis situations, evidence of abuse, personal stories from vulnerable people. This data must have additional protection beyond general observation data. Access restricted to Behavioral Health Advisor and Admin roles only. Every access logged in the audit trail. Evidence files stored securely with restricted access.</w:t>
       </w:r>
     </w:p>
     <w:p>
@@ -23252,14 +23252,14 @@
           <w:b/>
           <w:sz w:val="20"/>
         </w:rPr>
-        <w:t xml:space="preserve">Rule 5: Rate limiting on all API endpoints. </w:t>
+        <w:t xml:space="preserve">Requirement 5: Backups must exist outside the primary platform. </w:t>
       </w:r>
       <w:r>
         <w:rPr>
           <w:rFonts w:ascii="Arial" w:hAnsi="Arial"/>
           <w:sz w:val="20"/>
         </w:rPr>
-        <w:t xml:space="preserve">Observation submissions: 60 per hour per citizen (prevents spam and abuse). Harm reports: 10 per hour per IP (prevents abuse while allowing legitimate multiple reports). Sign-up: 5 per hour per IP (prevents bot registrations). Login attempts: 5 per 15 minutes per account (brute force protection, lockout after 5 failures with email notification). Partner API: rate limits per API key per tier. All rate limit violations logged to audit table.</w:t>
+        <w:t xml:space="preserve">Automated nightly database backup to an external location. If the primary hosting platform has a catastrophic failure, we must be able to restore the data. Backups tested periodically. As the platform grows and revenue allows, add redundant backups to a second provider.</w:t>
       </w:r>
     </w:p>
     <w:p>
@@ -23272,14 +23272,14 @@
           <w:b/>
           <w:sz w:val="20"/>
         </w:rPr>
-        <w:t xml:space="preserve">Rule 6: Authentication security. </w:t>
+        <w:t xml:space="preserve">Requirement 6: Protection against abuse and attacks. </w:t>
       </w:r>
       <w:r>
         <w:rPr>
           <w:rFonts w:ascii="Arial" w:hAnsi="Arial"/>
           <w:sz w:val="20"/>
         </w:rPr>
-        <w:t xml:space="preserve">Passwords hashed with bcrypt (cost factor 12). Google/Apple OAuth for social login. Two-factor authentication (2FA) required for Admin and Research Team roles. Optional for citizens. Session tokens: JWT with 24-hour expiry, refresh token rotation. Secure cookie flags (HttpOnly, Secure, SameSite=Strict). CSRF protection on all forms.</w:t>
+        <w:t xml:space="preserve">Protect against denial-of-service attacks, spam submissions, bot registrations, and API abuse. Rate limiting on all public-facing endpoints. Implement whatever protection the platform supports best.</w:t>
       </w:r>
     </w:p>
     <w:p>
@@ -23292,14 +23292,14 @@
           <w:b/>
           <w:sz w:val="20"/>
         </w:rPr>
-        <w:t xml:space="preserve">Rule 7: Environment variable security. </w:t>
+        <w:t xml:space="preserve">Requirement 7: Secrets and credentials must be secure. </w:t>
       </w:r>
       <w:r>
         <w:rPr>
           <w:rFonts w:ascii="Arial" w:hAnsi="Arial"/>
           <w:sz w:val="20"/>
         </w:rPr>
-        <w:t xml:space="preserve">All secrets (database credentials, API keys, Stripe keys, Credly keys, encryption keys) stored in Replit Secrets or equivalent secure environment variable store. NEVER hardcoded in source code. NEVER committed to Git. The .env file is in .gitignore. Rotate database credentials quarterly. Rotate API keys on any suspected compromise.</w:t>
+        <w:t xml:space="preserve">No API keys, database credentials, or secrets hardcoded in source code or committed to Git. Use the platform's secrets manager. Rotate credentials on any suspected compromise.</w:t>
       </w:r>
     </w:p>
     <w:p>
@@ -23312,14 +23312,14 @@
           <w:b/>
           <w:sz w:val="20"/>
         </w:rPr>
-        <w:t xml:space="preserve">Rule 8: Data residency and compliance. </w:t>
+        <w:t xml:space="preserve">Requirement 8: Privacy compliance (GDPR and CCPA). </w:t>
       </w:r>
       <w:r>
         <w:rPr>
           <w:rFonts w:ascii="Arial" w:hAnsi="Arial"/>
           <w:sz w:val="20"/>
         </w:rPr>
-        <w:t xml:space="preserve">Primary database and backups in US region (us-east-1 or us-west-2). GDPR compliance for EU citizens: right to access, right to erasure, right to data portability. CCPA compliance for California citizens. Privacy Policy and Terms of Service must reflect actual data handling practices. Data Processing Agreement (DPA) available for enterprise partners.</w:t>
+        <w:t xml:space="preserve">Citizens can export their data and delete their accounts. Personal data permanently deleted on request. Privacy Policy and Terms of Service accurately reflect data handling. International citizens have their rights respected.</w:t>
       </w:r>
     </w:p>
     <w:p>
@@ -23332,14 +23332,14 @@
           <w:b/>
           <w:sz w:val="20"/>
         </w:rPr>
-        <w:t xml:space="preserve">Rule 9: Incident response plan. </w:t>
+        <w:t xml:space="preserve">Requirement 9: Incident response. </w:t>
       </w:r>
       <w:r>
         <w:rPr>
           <w:rFonts w:ascii="Arial" w:hAnsi="Arial"/>
           <w:sz w:val="20"/>
         </w:rPr>
-        <w:t xml:space="preserve">If a breach is detected: (1) Isolate the affected system immediately. (2) Assess scope: which data was exposed, which citizens are affected. (3) Notify affected citizens within 72 hours per GDPR requirement. (4) Rotate all credentials. (5) Restore from verified backup. (6) Publish a transparent incident report. (7) Implement fixes to prevent recurrence. CEO (Dee Williams) is notified of any security incident within 1 hour of detection.</w:t>
+        <w:t xml:space="preserve">If a breach is detected: isolate the system, assess scope, notify affected citizens within 72 hours, rotate all credentials, restore from backup, publish transparent incident report. CEO (Dee Williams) notified within 1 hour of detection.</w:t>
       </w:r>
     </w:p>
     <w:p>
@@ -23352,14 +23352,14 @@
           <w:b/>
           <w:sz w:val="20"/>
         </w:rPr>
-        <w:t xml:space="preserve">Rule 10: Migration path off Replit. </w:t>
+        <w:t xml:space="preserve">Requirement 10: Portability. </w:t>
       </w:r>
       <w:r>
         <w:rPr>
           <w:rFonts w:ascii="Arial" w:hAnsi="Arial"/>
           <w:sz w:val="20"/>
         </w:rPr>
-        <w:t xml:space="preserve">Because the database is external and the backups are on separate providers, the entire application can be migrated off Replit to Vercel, Railway, Render, AWS, or any other host without data loss and within 24 hours. This is intentional. The hosting platform is replaceable. The data and the infrastructure around it are not. Build with portability from day one.</w:t>
+        <w:t xml:space="preserve">Build so the entire platform can be migrated to a different hosting provider if needed without data loss. Use standard database queries, no platform-specific lock-in. The hosting platform is replaceable. The data is not.</w:t>
       </w:r>
     </w:p>
     <w:p>

</xml_diff>